<commit_message>
docs: atualizacao da assinatura na minuta do Decreto para padrao de minuta oficial [NOME DO(A) GOVERNADOR(A)]
</commit_message>
<xml_diff>
--- a/producao/docs/docx/minuta-decreto-seinuc.docx
+++ b/producao/docs/docx/minuta-decreto-seinuc.docx
@@ -1865,9 +1865,9 @@
     </w:p>
     <w:p>
       <w:pPr>
-        <w:spacing w:line="360" w:lineRule="auto" w:before="240" w:after="0"/>
-        <w:ind w:firstLine="0"/>
-        <w:jc w:val="center"/>
+        <w:spacing w:line="360" w:lineRule="auto" w:before="0" w:after="0"/>
+        <w:ind w:firstLine="709"/>
+        <w:jc w:val="both"/>
       </w:pPr>
       <w:r>
         <w:rPr>
@@ -1876,7 +1876,7 @@
           <w:i w:val="0"/>
           <w:sz w:val="24"/>
         </w:rPr>
-        <w:t>HELDER BARBALHO</w:t>
+        <w:t>[NOME DO(A) GOVERNADOR(A)]</w:t>
       </w:r>
     </w:p>
     <w:p>
@@ -1892,7 +1892,7 @@
           <w:i/>
           <w:sz w:val="24"/>
         </w:rPr>
-        <w:t>Governador do Estado do Pará</w:t>
+        <w:t>Governador(a) do Estado do Pará</w:t>
       </w:r>
     </w:p>
     <w:sectPr>

</xml_diff>